<commit_message>
Aviso de Privacidad v1.0
</commit_message>
<xml_diff>
--- a/storage/app/plantillas/protocolo-optra-CT.docx
+++ b/storage/app/plantillas/protocolo-optra-CT.docx
@@ -622,8 +622,8 @@
         <w:tblLook w:val="04A0" w:firstRow="1" w:lastRow="0" w:firstColumn="1" w:lastColumn="0" w:noHBand="0" w:noVBand="1"/>
       </w:tblPr>
       <w:tblGrid>
-        <w:gridCol w:w="6252"/>
-        <w:gridCol w:w="1828"/>
+        <w:gridCol w:w="6394"/>
+        <w:gridCol w:w="1686"/>
       </w:tblGrid>
       <w:tr>
         <w:trPr>
@@ -631,7 +631,7 @@
         </w:trPr>
         <w:tc>
           <w:tcPr>
-            <w:tcW w:w="6252" w:type="dxa"/>
+            <w:tcW w:w="6394" w:type="dxa"/>
             <w:shd w:val="clear" w:color="auto" w:fill="FFFFFF"/>
             <w:noWrap/>
             <w:tcMar>
@@ -646,14 +646,16 @@
           <w:p>
             <w:pPr>
               <w:rPr>
-                <w:rFonts w:ascii="Gill Sans Nova" w:hAnsi="Gill Sans Nova"/>
                 <w:bCs/>
+                <w:sz w:val="20"/>
+                <w:szCs w:val="20"/>
               </w:rPr>
             </w:pPr>
             <w:r>
               <w:rPr>
-                <w:rFonts w:ascii="Gill Sans Nova" w:hAnsi="Gill Sans Nova"/>
                 <w:bCs/>
+                <w:sz w:val="20"/>
+                <w:szCs w:val="20"/>
               </w:rPr>
               <w:t>AUTOBUSES CENTRALES DE GUANAJUATO S.A. DE C.V.</w:t>
             </w:r>
@@ -661,43 +663,7 @@
         </w:tc>
         <w:tc>
           <w:tcPr>
-            <w:tcW w:w="1828" w:type="dxa"/>
-            <w:shd w:val="clear" w:color="auto" w:fill="FFFFFF"/>
-            <w:noWrap/>
-            <w:tcMar>
-              <w:top w:w="15" w:type="dxa"/>
-              <w:left w:w="15" w:type="dxa"/>
-              <w:bottom w:w="0" w:type="dxa"/>
-              <w:right w:w="15" w:type="dxa"/>
-            </w:tcMar>
-            <w:vAlign w:val="bottom"/>
-            <w:hideMark/>
-          </w:tcPr>
-          <w:p>
-            <w:pPr>
-              <w:jc w:val="center"/>
-              <w:rPr>
-                <w:rFonts w:ascii="Gill Sans Nova" w:hAnsi="Gill Sans Nova"/>
-                <w:bCs/>
-              </w:rPr>
-            </w:pPr>
-            <w:r>
-              <w:rPr>
-                <w:rFonts w:ascii="Gill Sans Nova" w:hAnsi="Gill Sans Nova"/>
-                <w:bCs/>
-              </w:rPr>
-              <w:t>ACG9708262JA</w:t>
-            </w:r>
-          </w:p>
-        </w:tc>
-      </w:tr>
-      <w:tr>
-        <w:trPr>
-          <w:trHeight w:val="225"/>
-        </w:trPr>
-        <w:tc>
-          <w:tcPr>
-            <w:tcW w:w="6252" w:type="dxa"/>
+            <w:tcW w:w="1686" w:type="dxa"/>
             <w:shd w:val="clear" w:color="auto" w:fill="FFFFFF"/>
             <w:noWrap/>
             <w:tcMar>
@@ -712,47 +678,18 @@
           <w:p>
             <w:pPr>
               <w:rPr>
-                <w:rFonts w:ascii="Gill Sans Nova" w:hAnsi="Gill Sans Nova"/>
                 <w:bCs/>
+                <w:sz w:val="20"/>
+                <w:szCs w:val="20"/>
               </w:rPr>
             </w:pPr>
             <w:r>
               <w:rPr>
-                <w:rFonts w:ascii="Gill Sans Nova" w:hAnsi="Gill Sans Nova"/>
                 <w:bCs/>
+                <w:sz w:val="20"/>
+                <w:szCs w:val="20"/>
               </w:rPr>
-              <w:t>AUTOBUSES Y SERVICIOS DE PASAJEROS S.A. DE C.V.</w:t>
-            </w:r>
-          </w:p>
-        </w:tc>
-        <w:tc>
-          <w:tcPr>
-            <w:tcW w:w="1828" w:type="dxa"/>
-            <w:shd w:val="clear" w:color="auto" w:fill="FFFFFF"/>
-            <w:noWrap/>
-            <w:tcMar>
-              <w:top w:w="15" w:type="dxa"/>
-              <w:left w:w="15" w:type="dxa"/>
-              <w:bottom w:w="0" w:type="dxa"/>
-              <w:right w:w="15" w:type="dxa"/>
-            </w:tcMar>
-            <w:vAlign w:val="bottom"/>
-            <w:hideMark/>
-          </w:tcPr>
-          <w:p>
-            <w:pPr>
-              <w:jc w:val="center"/>
-              <w:rPr>
-                <w:rFonts w:ascii="Gill Sans Nova" w:hAnsi="Gill Sans Nova"/>
-                <w:bCs/>
-              </w:rPr>
-            </w:pPr>
-            <w:r>
-              <w:rPr>
-                <w:rFonts w:ascii="Gill Sans Nova" w:hAnsi="Gill Sans Nova"/>
-                <w:bCs/>
-              </w:rPr>
-              <w:t>ASP110815HE4</w:t>
+              <w:t>ACG9708262JA</w:t>
             </w:r>
           </w:p>
         </w:tc>
@@ -763,7 +700,7 @@
         </w:trPr>
         <w:tc>
           <w:tcPr>
-            <w:tcW w:w="6252" w:type="dxa"/>
+            <w:tcW w:w="6394" w:type="dxa"/>
             <w:shd w:val="clear" w:color="auto" w:fill="FFFFFF"/>
             <w:noWrap/>
             <w:tcMar>
@@ -778,58 +715,24 @@
           <w:p>
             <w:pPr>
               <w:rPr>
-                <w:rFonts w:ascii="Gill Sans Nova" w:hAnsi="Gill Sans Nova"/>
                 <w:bCs/>
+                <w:sz w:val="20"/>
+                <w:szCs w:val="20"/>
               </w:rPr>
             </w:pPr>
             <w:r>
               <w:rPr>
-                <w:rFonts w:ascii="Gill Sans Nova" w:hAnsi="Gill Sans Nova"/>
                 <w:bCs/>
+                <w:sz w:val="20"/>
+                <w:szCs w:val="20"/>
               </w:rPr>
-              <w:t>AUTOBUSES URBANOS Y SUBURBANOS DE LEON S.A. DE C.V.</w:t>
+              <w:t>AUTOBUSES Y SERVICIOS DE PASAJEROS S.A. DE C.V.</w:t>
             </w:r>
           </w:p>
         </w:tc>
         <w:tc>
           <w:tcPr>
-            <w:tcW w:w="1828" w:type="dxa"/>
-            <w:shd w:val="clear" w:color="auto" w:fill="FFFFFF"/>
-            <w:noWrap/>
-            <w:tcMar>
-              <w:top w:w="15" w:type="dxa"/>
-              <w:left w:w="15" w:type="dxa"/>
-              <w:bottom w:w="0" w:type="dxa"/>
-              <w:right w:w="15" w:type="dxa"/>
-            </w:tcMar>
-            <w:vAlign w:val="bottom"/>
-            <w:hideMark/>
-          </w:tcPr>
-          <w:p>
-            <w:pPr>
-              <w:jc w:val="center"/>
-              <w:rPr>
-                <w:rFonts w:ascii="Gill Sans Nova" w:hAnsi="Gill Sans Nova"/>
-                <w:bCs/>
-              </w:rPr>
-            </w:pPr>
-            <w:r>
-              <w:rPr>
-                <w:rFonts w:ascii="Gill Sans Nova" w:hAnsi="Gill Sans Nova"/>
-                <w:bCs/>
-              </w:rPr>
-              <w:t>AUS840719590</w:t>
-            </w:r>
-          </w:p>
-        </w:tc>
-      </w:tr>
-      <w:tr>
-        <w:trPr>
-          <w:trHeight w:val="225"/>
-        </w:trPr>
-        <w:tc>
-          <w:tcPr>
-            <w:tcW w:w="6252" w:type="dxa"/>
+            <w:tcW w:w="1686" w:type="dxa"/>
             <w:shd w:val="clear" w:color="auto" w:fill="FFFFFF"/>
             <w:noWrap/>
             <w:tcMar>
@@ -844,47 +747,18 @@
           <w:p>
             <w:pPr>
               <w:rPr>
-                <w:rFonts w:ascii="Gill Sans Nova" w:hAnsi="Gill Sans Nova"/>
                 <w:bCs/>
+                <w:sz w:val="20"/>
+                <w:szCs w:val="20"/>
               </w:rPr>
             </w:pPr>
             <w:r>
               <w:rPr>
-                <w:rFonts w:ascii="Gill Sans Nova" w:hAnsi="Gill Sans Nova"/>
                 <w:bCs/>
+                <w:sz w:val="20"/>
+                <w:szCs w:val="20"/>
               </w:rPr>
-              <w:t>LINEA CENTRO BELLAVISTA S.A. DE C.V.</w:t>
-            </w:r>
-          </w:p>
-        </w:tc>
-        <w:tc>
-          <w:tcPr>
-            <w:tcW w:w="1828" w:type="dxa"/>
-            <w:shd w:val="clear" w:color="auto" w:fill="FFFFFF"/>
-            <w:noWrap/>
-            <w:tcMar>
-              <w:top w:w="15" w:type="dxa"/>
-              <w:left w:w="15" w:type="dxa"/>
-              <w:bottom w:w="0" w:type="dxa"/>
-              <w:right w:w="15" w:type="dxa"/>
-            </w:tcMar>
-            <w:vAlign w:val="bottom"/>
-            <w:hideMark/>
-          </w:tcPr>
-          <w:p>
-            <w:pPr>
-              <w:jc w:val="center"/>
-              <w:rPr>
-                <w:rFonts w:ascii="Gill Sans Nova" w:hAnsi="Gill Sans Nova"/>
-                <w:bCs/>
-              </w:rPr>
-            </w:pPr>
-            <w:r>
-              <w:rPr>
-                <w:rFonts w:ascii="Gill Sans Nova" w:hAnsi="Gill Sans Nova"/>
-                <w:bCs/>
-              </w:rPr>
-              <w:t>LCB810228TV2</w:t>
+              <w:t>ASP110815HE4</w:t>
             </w:r>
           </w:p>
         </w:tc>
@@ -895,7 +769,7 @@
         </w:trPr>
         <w:tc>
           <w:tcPr>
-            <w:tcW w:w="6252" w:type="dxa"/>
+            <w:tcW w:w="6394" w:type="dxa"/>
             <w:shd w:val="clear" w:color="auto" w:fill="FFFFFF"/>
             <w:noWrap/>
             <w:tcMar>
@@ -910,58 +784,24 @@
           <w:p>
             <w:pPr>
               <w:rPr>
-                <w:rFonts w:ascii="Gill Sans Nova" w:hAnsi="Gill Sans Nova"/>
                 <w:bCs/>
+                <w:sz w:val="20"/>
+                <w:szCs w:val="20"/>
               </w:rPr>
             </w:pPr>
             <w:r>
               <w:rPr>
-                <w:rFonts w:ascii="Gill Sans Nova" w:hAnsi="Gill Sans Nova"/>
                 <w:bCs/>
+                <w:sz w:val="20"/>
+                <w:szCs w:val="20"/>
               </w:rPr>
-              <w:t>LINEA CENTRO ESTACION S.A. DE C.V.</w:t>
+              <w:t>AUTOBUSES URBANOS Y SUBURBANOS DE LEON S.A. DE C.V.</w:t>
             </w:r>
           </w:p>
         </w:tc>
         <w:tc>
           <w:tcPr>
-            <w:tcW w:w="1828" w:type="dxa"/>
-            <w:shd w:val="clear" w:color="auto" w:fill="FFFFFF"/>
-            <w:noWrap/>
-            <w:tcMar>
-              <w:top w:w="15" w:type="dxa"/>
-              <w:left w:w="15" w:type="dxa"/>
-              <w:bottom w:w="0" w:type="dxa"/>
-              <w:right w:w="15" w:type="dxa"/>
-            </w:tcMar>
-            <w:vAlign w:val="bottom"/>
-            <w:hideMark/>
-          </w:tcPr>
-          <w:p>
-            <w:pPr>
-              <w:jc w:val="center"/>
-              <w:rPr>
-                <w:rFonts w:ascii="Gill Sans Nova" w:hAnsi="Gill Sans Nova"/>
-                <w:bCs/>
-              </w:rPr>
-            </w:pPr>
-            <w:r>
-              <w:rPr>
-                <w:rFonts w:ascii="Gill Sans Nova" w:hAnsi="Gill Sans Nova"/>
-                <w:bCs/>
-              </w:rPr>
-              <w:t>LCE810519QP9</w:t>
-            </w:r>
-          </w:p>
-        </w:tc>
-      </w:tr>
-      <w:tr>
-        <w:trPr>
-          <w:trHeight w:val="225"/>
-        </w:trPr>
-        <w:tc>
-          <w:tcPr>
-            <w:tcW w:w="6252" w:type="dxa"/>
+            <w:tcW w:w="1686" w:type="dxa"/>
             <w:shd w:val="clear" w:color="auto" w:fill="FFFFFF"/>
             <w:noWrap/>
             <w:tcMar>
@@ -976,47 +816,18 @@
           <w:p>
             <w:pPr>
               <w:rPr>
-                <w:rFonts w:ascii="Gill Sans Nova" w:hAnsi="Gill Sans Nova"/>
                 <w:bCs/>
+                <w:sz w:val="20"/>
+                <w:szCs w:val="20"/>
               </w:rPr>
             </w:pPr>
             <w:r>
               <w:rPr>
-                <w:rFonts w:ascii="Gill Sans Nova" w:hAnsi="Gill Sans Nova"/>
                 <w:bCs/>
+                <w:sz w:val="20"/>
+                <w:szCs w:val="20"/>
               </w:rPr>
-              <w:t>RED INTEGRAL OPTIBUS S.A. DE C.V.</w:t>
-            </w:r>
-          </w:p>
-        </w:tc>
-        <w:tc>
-          <w:tcPr>
-            <w:tcW w:w="1828" w:type="dxa"/>
-            <w:shd w:val="clear" w:color="auto" w:fill="FFFFFF"/>
-            <w:noWrap/>
-            <w:tcMar>
-              <w:top w:w="15" w:type="dxa"/>
-              <w:left w:w="15" w:type="dxa"/>
-              <w:bottom w:w="0" w:type="dxa"/>
-              <w:right w:w="15" w:type="dxa"/>
-            </w:tcMar>
-            <w:vAlign w:val="bottom"/>
-            <w:hideMark/>
-          </w:tcPr>
-          <w:p>
-            <w:pPr>
-              <w:jc w:val="center"/>
-              <w:rPr>
-                <w:rFonts w:ascii="Gill Sans Nova" w:hAnsi="Gill Sans Nova"/>
-                <w:bCs/>
-              </w:rPr>
-            </w:pPr>
-            <w:r>
-              <w:rPr>
-                <w:rFonts w:ascii="Gill Sans Nova" w:hAnsi="Gill Sans Nova"/>
-                <w:bCs/>
-              </w:rPr>
-              <w:t>RIO0304088E0</w:t>
+              <w:t>AUS840719590</w:t>
             </w:r>
           </w:p>
         </w:tc>
@@ -1027,7 +838,7 @@
         </w:trPr>
         <w:tc>
           <w:tcPr>
-            <w:tcW w:w="6252" w:type="dxa"/>
+            <w:tcW w:w="6394" w:type="dxa"/>
             <w:shd w:val="clear" w:color="auto" w:fill="FFFFFF"/>
             <w:noWrap/>
             <w:tcMar>
@@ -1042,22 +853,24 @@
           <w:p>
             <w:pPr>
               <w:rPr>
-                <w:rFonts w:ascii="Gill Sans Nova" w:hAnsi="Gill Sans Nova"/>
                 <w:bCs/>
+                <w:sz w:val="20"/>
+                <w:szCs w:val="20"/>
               </w:rPr>
             </w:pPr>
             <w:r>
               <w:rPr>
-                <w:rFonts w:ascii="Gill Sans Nova" w:hAnsi="Gill Sans Nova"/>
                 <w:bCs/>
+                <w:sz w:val="20"/>
+                <w:szCs w:val="20"/>
               </w:rPr>
-              <w:t>RED DE SERVICIOS INTEGRALES DE TRANSPORTE S.A. DE C.V.</w:t>
+              <w:t>LINEA CENTRO BELLAVISTA S.A. DE C.V.</w:t>
             </w:r>
           </w:p>
         </w:tc>
         <w:tc>
           <w:tcPr>
-            <w:tcW w:w="1828" w:type="dxa"/>
+            <w:tcW w:w="1686" w:type="dxa"/>
             <w:shd w:val="clear" w:color="auto" w:fill="FFFFFF"/>
             <w:noWrap/>
             <w:tcMar>
@@ -1071,16 +884,224 @@
           </w:tcPr>
           <w:p>
             <w:pPr>
-              <w:jc w:val="center"/>
               <w:rPr>
-                <w:rFonts w:ascii="Gill Sans Nova" w:hAnsi="Gill Sans Nova"/>
                 <w:bCs/>
+                <w:sz w:val="20"/>
+                <w:szCs w:val="20"/>
               </w:rPr>
             </w:pPr>
             <w:r>
               <w:rPr>
-                <w:rFonts w:ascii="Gill Sans Nova" w:hAnsi="Gill Sans Nova"/>
                 <w:bCs/>
+                <w:sz w:val="20"/>
+                <w:szCs w:val="20"/>
+              </w:rPr>
+              <w:t>LCB810228TV2</w:t>
+            </w:r>
+          </w:p>
+        </w:tc>
+      </w:tr>
+      <w:tr>
+        <w:trPr>
+          <w:trHeight w:val="225"/>
+        </w:trPr>
+        <w:tc>
+          <w:tcPr>
+            <w:tcW w:w="6394" w:type="dxa"/>
+            <w:shd w:val="clear" w:color="auto" w:fill="FFFFFF"/>
+            <w:noWrap/>
+            <w:tcMar>
+              <w:top w:w="15" w:type="dxa"/>
+              <w:left w:w="15" w:type="dxa"/>
+              <w:bottom w:w="0" w:type="dxa"/>
+              <w:right w:w="15" w:type="dxa"/>
+            </w:tcMar>
+            <w:vAlign w:val="bottom"/>
+            <w:hideMark/>
+          </w:tcPr>
+          <w:p>
+            <w:pPr>
+              <w:rPr>
+                <w:bCs/>
+                <w:sz w:val="20"/>
+                <w:szCs w:val="20"/>
+              </w:rPr>
+            </w:pPr>
+            <w:r>
+              <w:rPr>
+                <w:bCs/>
+                <w:sz w:val="20"/>
+                <w:szCs w:val="20"/>
+              </w:rPr>
+              <w:t>LINEA CENTRO ESTACION S.A. DE C.V.</w:t>
+            </w:r>
+          </w:p>
+        </w:tc>
+        <w:tc>
+          <w:tcPr>
+            <w:tcW w:w="1686" w:type="dxa"/>
+            <w:shd w:val="clear" w:color="auto" w:fill="FFFFFF"/>
+            <w:noWrap/>
+            <w:tcMar>
+              <w:top w:w="15" w:type="dxa"/>
+              <w:left w:w="15" w:type="dxa"/>
+              <w:bottom w:w="0" w:type="dxa"/>
+              <w:right w:w="15" w:type="dxa"/>
+            </w:tcMar>
+            <w:vAlign w:val="bottom"/>
+            <w:hideMark/>
+          </w:tcPr>
+          <w:p>
+            <w:pPr>
+              <w:rPr>
+                <w:bCs/>
+                <w:sz w:val="20"/>
+                <w:szCs w:val="20"/>
+              </w:rPr>
+            </w:pPr>
+            <w:r>
+              <w:rPr>
+                <w:bCs/>
+                <w:sz w:val="20"/>
+                <w:szCs w:val="20"/>
+              </w:rPr>
+              <w:t>LCE810519QP9</w:t>
+            </w:r>
+          </w:p>
+        </w:tc>
+      </w:tr>
+      <w:tr>
+        <w:trPr>
+          <w:trHeight w:val="225"/>
+        </w:trPr>
+        <w:tc>
+          <w:tcPr>
+            <w:tcW w:w="6394" w:type="dxa"/>
+            <w:shd w:val="clear" w:color="auto" w:fill="FFFFFF"/>
+            <w:noWrap/>
+            <w:tcMar>
+              <w:top w:w="15" w:type="dxa"/>
+              <w:left w:w="15" w:type="dxa"/>
+              <w:bottom w:w="0" w:type="dxa"/>
+              <w:right w:w="15" w:type="dxa"/>
+            </w:tcMar>
+            <w:vAlign w:val="bottom"/>
+            <w:hideMark/>
+          </w:tcPr>
+          <w:p>
+            <w:pPr>
+              <w:rPr>
+                <w:bCs/>
+                <w:sz w:val="20"/>
+                <w:szCs w:val="20"/>
+              </w:rPr>
+            </w:pPr>
+            <w:r>
+              <w:rPr>
+                <w:bCs/>
+                <w:sz w:val="20"/>
+                <w:szCs w:val="20"/>
+              </w:rPr>
+              <w:t>RED INTEGRAL OPTIBUS S.A. DE C.V.</w:t>
+            </w:r>
+          </w:p>
+        </w:tc>
+        <w:tc>
+          <w:tcPr>
+            <w:tcW w:w="1686" w:type="dxa"/>
+            <w:shd w:val="clear" w:color="auto" w:fill="FFFFFF"/>
+            <w:noWrap/>
+            <w:tcMar>
+              <w:top w:w="15" w:type="dxa"/>
+              <w:left w:w="15" w:type="dxa"/>
+              <w:bottom w:w="0" w:type="dxa"/>
+              <w:right w:w="15" w:type="dxa"/>
+            </w:tcMar>
+            <w:vAlign w:val="bottom"/>
+            <w:hideMark/>
+          </w:tcPr>
+          <w:p>
+            <w:pPr>
+              <w:rPr>
+                <w:bCs/>
+                <w:sz w:val="20"/>
+                <w:szCs w:val="20"/>
+              </w:rPr>
+            </w:pPr>
+            <w:r>
+              <w:rPr>
+                <w:bCs/>
+                <w:sz w:val="20"/>
+                <w:szCs w:val="20"/>
+              </w:rPr>
+              <w:t>RIO0304088E0</w:t>
+            </w:r>
+          </w:p>
+        </w:tc>
+      </w:tr>
+      <w:tr>
+        <w:trPr>
+          <w:trHeight w:val="225"/>
+        </w:trPr>
+        <w:tc>
+          <w:tcPr>
+            <w:tcW w:w="6394" w:type="dxa"/>
+            <w:shd w:val="clear" w:color="auto" w:fill="FFFFFF"/>
+            <w:noWrap/>
+            <w:tcMar>
+              <w:top w:w="15" w:type="dxa"/>
+              <w:left w:w="15" w:type="dxa"/>
+              <w:bottom w:w="0" w:type="dxa"/>
+              <w:right w:w="15" w:type="dxa"/>
+            </w:tcMar>
+            <w:vAlign w:val="bottom"/>
+            <w:hideMark/>
+          </w:tcPr>
+          <w:p>
+            <w:pPr>
+              <w:rPr>
+                <w:bCs/>
+                <w:sz w:val="20"/>
+                <w:szCs w:val="20"/>
+              </w:rPr>
+            </w:pPr>
+            <w:r>
+              <w:rPr>
+                <w:bCs/>
+                <w:sz w:val="20"/>
+                <w:szCs w:val="20"/>
+              </w:rPr>
+              <w:t>RED DE SERVICIOS INTEGRALES DE TRANSPORTE S.A. DE C.V.</w:t>
+            </w:r>
+          </w:p>
+        </w:tc>
+        <w:tc>
+          <w:tcPr>
+            <w:tcW w:w="1686" w:type="dxa"/>
+            <w:shd w:val="clear" w:color="auto" w:fill="FFFFFF"/>
+            <w:noWrap/>
+            <w:tcMar>
+              <w:top w:w="15" w:type="dxa"/>
+              <w:left w:w="15" w:type="dxa"/>
+              <w:bottom w:w="0" w:type="dxa"/>
+              <w:right w:w="15" w:type="dxa"/>
+            </w:tcMar>
+            <w:vAlign w:val="bottom"/>
+            <w:hideMark/>
+          </w:tcPr>
+          <w:p>
+            <w:pPr>
+              <w:rPr>
+                <w:bCs/>
+                <w:sz w:val="20"/>
+                <w:szCs w:val="20"/>
+              </w:rPr>
+            </w:pPr>
+            <w:r>
+              <w:rPr>
+                <w:bCs/>
+                <w:sz w:val="20"/>
+                <w:szCs w:val="20"/>
               </w:rPr>
               <w:t>RSI140123915</w:t>
             </w:r>
@@ -27779,6 +27800,9 @@
         </w:rPr>
       </w:pPr>
       <w:r>
+        <w:rPr>
+          <w:noProof/>
+        </w:rPr>
         <w:drawing>
           <wp:anchor distT="0" distB="0" distL="0" distR="0" simplePos="0" relativeHeight="251655680" behindDoc="0" locked="0" layoutInCell="1" allowOverlap="1" wp14:anchorId="31DD63B9" wp14:editId="15476CD4">
             <wp:simplePos x="0" y="0"/>
@@ -27824,6 +27848,9 @@
         </w:drawing>
       </w:r>
       <w:r>
+        <w:rPr>
+          <w:noProof/>
+        </w:rPr>
         <w:drawing>
           <wp:anchor distT="0" distB="0" distL="0" distR="0" simplePos="0" relativeHeight="251656704" behindDoc="0" locked="0" layoutInCell="1" allowOverlap="1" wp14:anchorId="7026B277" wp14:editId="17997AF1">
             <wp:simplePos x="0" y="0"/>

</xml_diff>